<commit_message>
Add comprehensive dashboard guide and update final report with calibration changes
- Introduced a new `DASHBOARD_GUIDE.md` detailing the purpose and functionality of the customer retention dashboard.
- Updated `FINAL_REPORT.md` to reflect changes in model calibration from isotonic to Platt scaling, including updated metrics and findings.
- Modified system architecture diagrams and related documentation to align with the new calibration method.
- Adjusted scoring and training scripts to implement Platt scaling for improved probability calibration.
- Updated model metrics in `metrics.json` to reflect the latest evaluation results post-calibration change.
</commit_message>
<xml_diff>
--- a/docs/Final_Report.docx
+++ b/docs/Final_Report.docx
@@ -180,7 +180,7 @@
         <w:jc w:val="both"/>
       </w:pPr>
       <w:r>
-        <w:t>The system is a reproducible ETL → Data Preparation → Model → Dashboard pipeline (fixed seed 42, one-command rebuild) over the 5,000-subscriber, 14-column Netflix Customer Churn dataset (Kaggle; churn rate 50.3%, MRR $68,417). A PostgreSQL warehouse (fact table plus three KPI views) supports the descriptive layer; four classifiers — Logistic Regression, Decision Tree, Random Forest, and XGBoost — are trained inside leak-free pipelines with stratified cross-validation, naive baselines, and isotonic calibration. The CV-selected XGBoost attains held-out PR-AUC 1.000 (calibrated 0.9997, Brier 0.0054) against baselines of 0.503 and 0.708. Because a near-perfect score is a red flag rather than a triumph, the report contributes two validity diagnostics: an overfitting check (train-test PR-AUC gaps of +0.0001 to +0.016 across all four models; even a ~35-parameter linear model scores 0.982, so the results cannot be memorization) and a feature-family ablation (removing engagement features collapses PR-AUC to 0.796; demographics alone reach 0.578, barely above random 0.503), which localizes all predictive signal in behavior while disclosing that a snapshot dataset cannot distinguish early-warning signal from post-churn artifact — the reported scores are therefore an upper bound.</w:t>
+        <w:t>The system is a reproducible ETL → Data Preparation → Model → Dashboard pipeline (fixed seed 42, one-command rebuild) over the 5,000-subscriber, 14-column Netflix Customer Churn dataset (Kaggle; churn rate 50.3%, MRR $68,417). A PostgreSQL warehouse (fact table plus three KPI views) supports the descriptive layer; four classifiers — Logistic Regression, Decision Tree, Random Forest, and XGBoost — are trained inside leak-free pipelines with stratified cross-validation, naive baselines, and Platt (sigmoid) calibration. The CV-selected XGBoost attains held-out PR-AUC 1.000 (calibrated 0.9999, Brier 0.0052) against baselines of 0.503 and 0.708. Because a near-perfect score is a red flag rather than a triumph, the report contributes two validity diagnostics: an overfitting check (train-test PR-AUC gaps of +0.0001 to +0.016 across all four models; even a ~35-parameter linear model scores 0.982, so the results cannot be memorization) and a feature-family ablation (removing engagement features collapses PR-AUC to 0.796; demographics alone reach 0.578, barely above random 0.503), which localizes all predictive signal in behavior while disclosing that a snapshot dataset cannot distinguish early-warning signal from post-churn artifact — the reported scores are therefore an upper bound.</w:t>
       </w:r>
     </w:p>
     <w:p>
@@ -188,7 +188,7 @@
         <w:jc w:val="both"/>
       </w:pPr>
       <w:r>
-        <w:t>Scoring all 5,000 customers yields 2,507 high-risk subscribers and ≈$397,289 of annual revenue at risk; under a transparent accounting formula (Σ revenue at risk × assumed save rate) a 30% save rate on the high-risk tier corresponds to ≈$118,000/year of retention opportunity ($39k/$79k/$158k at 10%/20%/40%). The four-page Streamlit dashboard — Home, Descriptive Analytics, Churn Risk, and Customer Simulation — maps onto Simon's Intelligence–Design–Choice framework and runs live on AWS EC2 via Docker Compose, including a customer-level what-if simulator driven by the trained calibrated model. The contribution of the project is threefold: a reproducible open-data churn-DSS pipeline, an explicit account of how a calibrated churn probability is computed (log-odds → sigmoid, verified exact → isotonic calibration), and a validity-diagnostic framework that protects against over-selling near-perfect scores on synthetic, highly separable data.</w:t>
+        <w:t>Scoring all 5,000 customers yields 2,510 high-risk subscribers and ≈$397,353 of annual revenue at risk; under a transparent accounting formula (Σ revenue at risk × assumed save rate) a 30% save rate on the high-risk tier corresponds to ≈$118,000/year of retention opportunity ($39k/$79k/$157k at 10%/20%/40%). The four-page Streamlit dashboard — Home, Descriptive Analytics, Churn Risk, and Customer Simulation — maps onto Simon's Intelligence–Design–Choice framework and runs live on AWS EC2 via Docker Compose, including a customer-level what-if simulator driven by the trained calibrated model. The contribution of the project is threefold: a reproducible open-data churn-DSS pipeline, an explicit account of how a calibrated churn probability is computed (log-odds → sigmoid, verified exact → Platt calibration), and a validity-diagnostic framework that protects against over-selling near-perfect scores on synthetic, highly separable data.</w:t>
       </w:r>
     </w:p>
     <w:p>
@@ -728,16 +728,16 @@
         <w:t>dollar weighting</w:t>
       </w:r>
       <w:r>
-        <w:t xml:space="preserve"> (probability × revenue), so the model must output a probability, not a 0/1 label. Classifiers produce probabilities by mapping an unbounded raw score (log-odds) through the logistic (sigmoid) function; however, these raw probabilities are often poorly calibrated, and boosted trees in particular tend to be over-confident (Niculescu-Mizil &amp; Caruana, 2005). Two standard post-hoc corrections exist: Platt scaling, which fits a sigmoid to the scores (Platt, 1999), and isotonic regression, a non-parametric monotonic remapping (Zadrozny &amp; Elkan, 2002). We use </w:t>
+        <w:t xml:space="preserve"> (probability × revenue), so the model must output a probability, not a 0/1 label. Classifiers produce probabilities by mapping an unbounded raw score (log-odds) through the logistic (sigmoid) function; however, these raw probabilities are often poorly calibrated, and boosted trees in particular tend to be over-confident (Niculescu-Mizil &amp; Caruana, 2005). Two standard post-hoc corrections exist: Platt scaling, which fits a sigmoid to the scores (Platt, 1999), and isotonic regression, a non-parametric monotonic remapping (Zadrozny &amp; Elkan, 2002). We evaluated both: isotonic calibration was applied first, following Niculescu-Mizil and Caruana's (2005) finding that it is the more effective correction for tree ensembles when sufficient data is available, but on this nearly separable data its step function emitted exact 0% and 100% probabilities — unacceptable for decision support. The final system therefore uses </w:t>
       </w:r>
       <w:r>
         <w:rPr>
           <w:b/>
         </w:rPr>
-        <w:t>isotonic calibration</w:t>
-      </w:r>
-      <w:r>
-        <w:t>, following Niculescu-Mizil and Caruana's (2005) finding that it is the more effective correction for tree ensembles when sufficient data is available.</w:t>
+        <w:t>Platt scaling</w:t>
+      </w:r>
+      <w:r>
+        <w:t>, which keeps every probability strictly within (0,1).</w:t>
       </w:r>
     </w:p>
     <w:p>
@@ -794,7 +794,7 @@
         <w:jc w:val="both"/>
       </w:pPr>
       <w:r>
-        <w:t>The literature supports four design commitments carried through this project: an ensemble-centred model portfolio with an interpretable baseline (2.1); probability-first outputs with isotonic calibration (2.2); PR-AUC-led evaluation against naive baselines (2.3); and a Simon-framework DSS over a warehouse-backed descriptive layer (2.4).</w:t>
+        <w:t>The literature supports four design commitments carried through this project: an ensemble-centred model portfolio with an interpretable baseline (2.1); probability-first outputs with Platt calibration (2.2); PR-AUC-led evaluation against naive baselines (2.3); and a Simon-framework DSS over a warehouse-backed descriptive layer (2.4).</w:t>
       </w:r>
     </w:p>
     <w:p>
@@ -1844,7 +1844,7 @@
         <w:rPr>
           <w:b/>
         </w:rPr>
-        <w:t>Isotonic calibration.</w:t>
+        <w:t>Platt (sigmoid) calibration.</w:t>
       </w:r>
       <w:r>
         <w:t xml:space="preserve"> Because boosted trees are characteristically over-confident (Niculescu-Mizil &amp; Caruana, 2005), the selected model is wrapped in </w:t>
@@ -1854,10 +1854,19 @@
           <w:rFonts w:ascii="Courier New" w:hAnsi="Courier New"/>
           <w:sz w:val="22"/>
         </w:rPr>
-        <w:t>CalibratedClassifierCV(method="isotonic", cv=5)</w:t>
-      </w:r>
-      <w:r>
-        <w:t xml:space="preserve"> (Zadrozny &amp; Elkan, 2002) — preferred over Platt scaling (Platt, 1999) for tree ensembles — so that a predicted 30% corresponds to an empirical churn rate of ≈30%. Calibration quality is measured by the Brier score (0.005 on the held-out test set).</w:t>
+        <w:t>CalibratedClassifierCV(method="sigmoid", cv=5)</w:t>
+      </w:r>
+      <w:r>
+        <w:t xml:space="preserve">. Isotonic regression (Zadrozny &amp; Elkan, 2002) was applied first, following the finding that it suits tree ensembles; on this nearly separable data, however, the isotonic step function degenerated into emitting exact 0% and 100% probabilities — unacceptable for decision support, where no customer is </w:t>
+      </w:r>
+      <w:r>
+        <w:rPr>
+          <w:i/>
+        </w:rPr>
+        <w:t>certain</w:t>
+      </w:r>
+      <w:r>
+        <w:t xml:space="preserve"> to churn or to stay. The final system therefore uses Platt scaling (Platt, 1999), whose smooth sigmoid fit keeps every probability strictly inside (0,1) — final range 0.7%–99.6% — at identical calibration quality: a predicted 30% corresponds to an empirical churn rate of ≈30%, measured by the Brier score (0.005 on the held-out test set).</w:t>
       </w:r>
     </w:p>
     <w:p>
@@ -2446,7 +2455,7 @@
         <w:jc w:val="both"/>
       </w:pPr>
       <w:r>
-        <w:t>The methodology combines a cleaned, warehouse-backed data layer (3.1); three engineered features with documented evidence of use (3.2); a four-model portfolio selected by cross-validation inside leak-free pipelines (3.3); a precisely stated probability chain — log-odds → sigmoid (verified exact) → isotonic calibration → business outputs (3.4); baselines, a leakage audit, and two validity diagnostics (3.5); a reproducible Dockerised architecture deployed on AWS (3.6); and a transparent business-impact accounting (3.7).</w:t>
+        <w:t>The methodology combines a cleaned, warehouse-backed data layer (3.1); three engineered features with documented evidence of use (3.2); a four-model portfolio selected by cross-validation inside leak-free pipelines (3.3); a precisely stated probability chain — log-odds → sigmoid (verified exact) → Platt calibration → business outputs (3.4); baselines, a leakage audit, and two validity diagnostics (3.5); a reproducible Dockerised architecture deployed on AWS (3.6); and a transparent business-impact accounting (3.7).</w:t>
       </w:r>
     </w:p>
     <w:p>
@@ -3352,7 +3361,7 @@
         <w:jc w:val="both"/>
       </w:pPr>
       <w:r>
-        <w:t xml:space="preserve">The calibrated XGBoost reaches test PR-AUC 0.9997 with Brier score 0.0054. The key churn drivers by feature importance are engagement and recency: </w:t>
+        <w:t xml:space="preserve">The calibrated XGBoost reaches test PR-AUC 0.9999 with Brier score 0.0052. The key churn drivers by feature importance are engagement and recency: </w:t>
       </w:r>
       <w:r>
         <w:rPr>
@@ -3442,7 +3451,7 @@
         <w:t>Model status.</w:t>
       </w:r>
       <w:r>
-        <w:t xml:space="preserve"> The deployed model is </w:t>
+        <w:t xml:space="preserve"> The deployed classifier is </w:t>
       </w:r>
       <w:r>
         <w:rPr>
@@ -3451,7 +3460,7 @@
         <w:t>unchanged</w:t>
       </w:r>
       <w:r>
-        <w:t xml:space="preserve">: it remains the CV-selected, isotonic-calibrated XGBoost. No retrained "fixed" model exists, deliberately — the open validity question is </w:t>
+        <w:t xml:space="preserve">: it remains the CV-selected XGBoost (only its calibration wrapper was switched from isotonic to Platt scaling, which does not alter the classifier or its ranking). No retrained "fixed" model exists, deliberately — the open validity question is </w:t>
       </w:r>
       <w:r>
         <w:rPr>
@@ -3864,7 +3873,7 @@
         <w:jc w:val="both"/>
       </w:pPr>
       <w:r>
-        <w:t xml:space="preserve">The generalization gap is near zero for every model and fold-to-fold variance is tiny; an overfit model shows a large train–test gap, not this. Decisively, even the ≈35-parameter Logistic Regression — far too small to memorize 4,000 training rows — scores 0.982, so the near-perfect results cannot be memorization: the classes really are that separable. Consistent with this, the deployed probability distribution is bimodal — 98.4% of the 5,000 calibrated probabilities are below 5% or above 95%, and only 4 customers fall in the Medium band (0.40–0.70) — and calibration (Brier 0.005) confirms these extreme probabilities are empirically </w:t>
+        <w:t xml:space="preserve">The generalization gap is near zero for every model and fold-to-fold variance is tiny; an overfit model shows a large train–test gap, not this. Decisively, even the ≈35-parameter Logistic Regression — far too small to memorize 4,000 training rows — scores 0.982, so the near-perfect results cannot be memorization: the classes really are that separable. Consistent with this, the deployed probability distribution is bimodal — 98.9% of the 5,000 calibrated probabilities are below 5% or above 95%, and only 1 customer falls in the Medium band (0.40–0.70) — and calibration (Brier 0.005) confirms these extreme probabilities are empirically </w:t>
       </w:r>
       <w:r>
         <w:rPr>
@@ -4298,7 +4307,7 @@
         <w:rPr>
           <w:b/>
         </w:rPr>
-        <w:t>2,507 high-risk customers</w:t>
+        <w:t>2,510 high-risk customers</w:t>
       </w:r>
       <w:r>
         <w:t xml:space="preserve">, total annual revenue at risk ≈ </w:t>
@@ -4307,10 +4316,10 @@
         <w:rPr>
           <w:b/>
         </w:rPr>
-        <w:t>$397,289</w:t>
-      </w:r>
-      <w:r>
-        <w:t>, and a mean predicted churn probability of 50.4% (consistent with the actual churn rate of 50.3%). The tier distribution is Low 2,489 / Medium 4 / High 2,507 — the near-empty Medium band is itself diagnostic of the saturated probabilities discussed in Section 4.3.</w:t>
+        <w:t>$397,353</w:t>
+      </w:r>
+      <w:r>
+        <w:t>, and a mean predicted churn probability of 50.4% (consistent with the actual churn rate of 50.3%). The tier distribution is Low 2,489 / Medium 1 / High 2,510 — the near-empty Medium band is itself diagnostic of the bimodal probabilities discussed in Section 4.3 (spanning 0.7%–99.6%, never exactly certain under Platt scaling).</w:t>
       </w:r>
     </w:p>
     <w:p>
@@ -4507,7 +4516,7 @@
               <w:spacing w:before="0" w:after="0" w:line="240" w:lineRule="auto"/>
             </w:pPr>
             <w:r>
-              <w:t>≈$158k</w:t>
+              <w:t>≈$157k</w:t>
             </w:r>
           </w:p>
         </w:tc>
@@ -4749,7 +4758,7 @@
                 <w:rFonts w:ascii="Courier New" w:hAnsi="Courier New"/>
                 <w:sz w:val="22"/>
               </w:rPr>
-              <w:t>49a5df…</w:t>
+              <w:t>39a2da…</w:t>
             </w:r>
           </w:p>
         </w:tc>
@@ -4788,7 +4797,7 @@
               <w:spacing w:before="0" w:after="0" w:line="240" w:lineRule="auto"/>
             </w:pPr>
             <w:r>
-              <w:t>$167.25/yr</w:t>
+              <w:t>$215.05/yr</w:t>
             </w:r>
           </w:p>
         </w:tc>
@@ -4833,7 +4842,7 @@
                 <w:rFonts w:ascii="Courier New" w:hAnsi="Courier New"/>
                 <w:sz w:val="22"/>
               </w:rPr>
-              <w:t>2f2b96…</w:t>
+              <w:t>92ba88…</w:t>
             </w:r>
           </w:p>
         </w:tc>
@@ -4846,7 +4855,7 @@
               <w:spacing w:before="0" w:after="0" w:line="240" w:lineRule="auto"/>
             </w:pPr>
             <w:r>
-              <w:t>69.3%</w:t>
+              <w:t>60.4%</w:t>
             </w:r>
           </w:p>
         </w:tc>
@@ -4872,7 +4881,7 @@
               <w:spacing w:before="0" w:after="0" w:line="240" w:lineRule="auto"/>
             </w:pPr>
             <w:r>
-              <w:t>$74.77/yr</w:t>
+              <w:t>$65.11/yr</w:t>
             </w:r>
           </w:p>
         </w:tc>
@@ -4917,7 +4926,7 @@
                 <w:rFonts w:ascii="Courier New" w:hAnsi="Courier New"/>
                 <w:sz w:val="22"/>
               </w:rPr>
-              <w:t>09746f…</w:t>
+              <w:t>5ee0ae…</w:t>
             </w:r>
           </w:p>
         </w:tc>
@@ -4930,7 +4939,7 @@
               <w:spacing w:before="0" w:after="0" w:line="240" w:lineRule="auto"/>
             </w:pPr>
             <w:r>
-              <w:t>9.2%</w:t>
+              <w:t>0.7%</w:t>
             </w:r>
           </w:p>
         </w:tc>
@@ -4956,7 +4965,7 @@
               <w:spacing w:before="0" w:after="0" w:line="240" w:lineRule="auto"/>
             </w:pPr>
             <w:r>
-              <w:t>$15.52/yr</w:t>
+              <w:t>$1.26/yr</w:t>
             </w:r>
           </w:p>
         </w:tc>
@@ -4969,7 +4978,7 @@
               <w:spacing w:before="0" w:after="0" w:line="240" w:lineRule="auto"/>
             </w:pPr>
             <w:r>
-              <w:t>Low recent activity</w:t>
+              <w:t>Higher plan cost</w:t>
             </w:r>
           </w:p>
         </w:tc>
@@ -5185,7 +5194,7 @@
         <w:jc w:val="both"/>
       </w:pPr>
       <w:r>
-        <w:t>Descriptive analytics located churn in behavior (plan, engagement, recency) and quantified its cost (48.2% of MRR). Four models cleared both baselines by wide margins; the CV-selected XGBoost reached PR-AUC ≈1.000, which the validity diagnostics show is genuine separability of synthetic data rather than overfitting, while bounding what the score can claim. Scoring produced a prioritised, dollar-weighted customer list (2,507 high-risk; ≈$397k at risk; ≈$118k opportunity at a 30% save rate), delivered through a four-page deployed dashboard whose pages map onto Intelligence, Design, and Choice.</w:t>
+        <w:t>Descriptive analytics located churn in behavior (plan, engagement, recency) and quantified its cost (48.2% of MRR). Four models cleared both baselines by wide margins; the CV-selected XGBoost reached PR-AUC ≈1.000, which the validity diagnostics show is genuine separability of synthetic data rather than overfitting, while bounding what the score can claim. Scoring produced a prioritised, dollar-weighted customer list (2,510 high-risk; ≈$397k at risk; ≈$118k opportunity at a 30% save rate), delivered through a four-page deployed dashboard whose pages map onto Intelligence, Design, and Choice.</w:t>
       </w:r>
     </w:p>
     <w:p>
@@ -5291,7 +5300,7 @@
         <w:t>Predictive churn analysis — achieved with disclosed caveats.</w:t>
       </w:r>
       <w:r>
-        <w:t xml:space="preserve"> Four models under a leak-free, cross-validated protocol with baselines, isotonic calibration (Brier 0.005), a leakage audit (delta 0.003), an overfitting check (gaps ≤ +0.016), and a feature-family ablation localizing the signal in behavior; XGBoost selected by CV and retained deployed, with the scores framed as an upper bound on real-world performance.</w:t>
+        <w:t xml:space="preserve"> Four models under a leak-free, cross-validated protocol with baselines, Platt calibration (Brier 0.005), a leakage audit (delta 0.003), an overfitting check (gaps ≤ +0.016), and a feature-family ablation localizing the signal in behavior; XGBoost selected by CV and retained deployed, with the scores framed as an upper bound on real-world performance.</w:t>
       </w:r>
     </w:p>
     <w:p>

</xml_diff>